<commit_message>
Update error-based examples parameters
</commit_message>
<xml_diff>
--- a/examples/2_online_prediction/doc/dfr_cusum.docx
+++ b/examples/2_online_prediction/doc/dfr_cusum.docx
@@ -1482,7 +1482,25 @@
         <w:rPr>
           <w:rStyle w:val="NormalTok"/>
         </w:rPr>
-        <w:t xml:space="preserve">(), </w:t>
+        <w:t xml:space="preserve">(</w:t>
+      </w:r>
+      <w:r>
+        <w:rPr>
+          <w:rStyle w:val="AttributeTok"/>
+        </w:rPr>
+        <w:t xml:space="preserve">lambda=</w:t>
+      </w:r>
+      <w:r>
+        <w:rPr>
+          <w:rStyle w:val="DecValTok"/>
+        </w:rPr>
+        <w:t xml:space="preserve">10</w:t>
+      </w:r>
+      <w:r>
+        <w:rPr>
+          <w:rStyle w:val="NormalTok"/>
+        </w:rPr>
+        <w:t xml:space="preserve">), </w:t>
       </w:r>
       <w:r>
         <w:rPr>
@@ -3432,24 +3450,6 @@
         </w:rPr>
         <w:t xml:space="preserve">## [1] "Time Step:7"</w:t>
       </w:r>
-      <w:r>
-        <w:br/>
-      </w:r>
-      <w:r>
-        <w:rPr>
-          <w:rStyle w:val="VerbatimChar"/>
-        </w:rPr>
-        <w:t xml:space="preserve">## [1] "Time Step:8"</w:t>
-      </w:r>
-      <w:r>
-        <w:br/>
-      </w:r>
-      <w:r>
-        <w:rPr>
-          <w:rStyle w:val="VerbatimChar"/>
-        </w:rPr>
-        <w:t xml:space="preserve">## [1] "Time Step:9"</w:t>
-      </w:r>
     </w:p>
     <w:p>
       <w:pPr>
@@ -3470,6 +3470,24 @@
         <w:rPr>
           <w:rStyle w:val="VerbatimChar"/>
         </w:rPr>
+        <w:t xml:space="preserve">## [1] "Time Step:8"</w:t>
+      </w:r>
+      <w:r>
+        <w:br/>
+      </w:r>
+      <w:r>
+        <w:rPr>
+          <w:rStyle w:val="VerbatimChar"/>
+        </w:rPr>
+        <w:t xml:space="preserve">## [1] "Time Step:9"</w:t>
+      </w:r>
+      <w:r>
+        <w:br/>
+      </w:r>
+      <w:r>
+        <w:rPr>
+          <w:rStyle w:val="VerbatimChar"/>
+        </w:rPr>
         <w:t xml:space="preserve">## [1] "Time Step:10"</w:t>
       </w:r>
     </w:p>
@@ -3668,7 +3686,7 @@
         <w:rPr>
           <w:rStyle w:val="VerbatimChar"/>
         </w:rPr>
-        <w:t xml:space="preserve">## 1           2  0  0  0  0       0 0.0006835461</w:t>
+        <w:t xml:space="preserve">## 1           2  0  0  0  0       0 0.0007452965</w:t>
       </w:r>
       <w:r>
         <w:br/>
@@ -3677,7 +3695,7 @@
         <w:rPr>
           <w:rStyle w:val="VerbatimChar"/>
         </w:rPr>
-        <w:t xml:space="preserve">## 2           3 20  0 26  4       0 0.0065059662</w:t>
+        <w:t xml:space="preserve">## 2           3 20  0 26  4       0 0.0076189041</w:t>
       </w:r>
       <w:r>
         <w:br/>
@@ -3686,7 +3704,7 @@
         <w:rPr>
           <w:rStyle w:val="VerbatimChar"/>
         </w:rPr>
-        <w:t xml:space="preserve">## 3           4 20  0 29  1       0 0.0031049252</w:t>
+        <w:t xml:space="preserve">## 3           4 20  0 29  1       0 0.0030562878</w:t>
       </w:r>
       <w:r>
         <w:br/>
@@ -3695,7 +3713,7 @@
         <w:rPr>
           <w:rStyle w:val="VerbatimChar"/>
         </w:rPr>
-        <w:t xml:space="preserve">## 4           5 20  3 23  4       0 0.0030000210</w:t>
+        <w:t xml:space="preserve">## 4           5 20  3 23  4       0 0.0030148029</w:t>
       </w:r>
       <w:r>
         <w:br/>
@@ -3704,7 +3722,7 @@
         <w:rPr>
           <w:rStyle w:val="VerbatimChar"/>
         </w:rPr>
-        <w:t xml:space="preserve">## 5           6  2 18  1 29       0 0.0029611588</w:t>
+        <w:t xml:space="preserve">## 5           6  2 18  1 29       0 0.0038406849</w:t>
       </w:r>
       <w:r>
         <w:br/>
@@ -3713,7 +3731,7 @@
         <w:rPr>
           <w:rStyle w:val="VerbatimChar"/>
         </w:rPr>
-        <w:t xml:space="preserve">## 6           7  1 29  3 17       0 0.0029525757</w:t>
+        <w:t xml:space="preserve">## 6           7  0  0  0  0       1 0.0029833317</w:t>
       </w:r>
       <w:r>
         <w:br/>
@@ -3722,7 +3740,7 @@
         <w:rPr>
           <w:rStyle w:val="VerbatimChar"/>
         </w:rPr>
-        <w:t xml:space="preserve">## 7           8  0 25  4 21       0 0.0149669647</w:t>
+        <w:t xml:space="preserve">## 7           8 18  4 25  3       0 0.0070416927</w:t>
       </w:r>
       <w:r>
         <w:br/>
@@ -3731,7 +3749,7 @@
         <w:rPr>
           <w:rStyle w:val="VerbatimChar"/>
         </w:rPr>
-        <w:t xml:space="preserve">## 8           9  0  0  0  0       1 0.0040457249</w:t>
+        <w:t xml:space="preserve">## 8           9 21  4 17  8       0 0.0037670135</w:t>
       </w:r>
       <w:r>
         <w:br/>
@@ -3740,7 +3758,7 @@
         <w:rPr>
           <w:rStyle w:val="VerbatimChar"/>
         </w:rPr>
-        <w:t xml:space="preserve">## 9          10 16  3 23  8       0 0.0089838505</w:t>
+        <w:t xml:space="preserve">## 9          10 20  1 25  4       0 0.0037658215</w:t>
       </w:r>
     </w:p>
     <w:p>
@@ -4329,7 +4347,7 @@
         <w:rPr>
           <w:rStyle w:val="VerbatimChar"/>
         </w:rPr>
-        <w:t xml:space="preserve">## [1] "Precision 0.503184713375796 Recall 0.484662576687117 F1 0.49375 Accuracy 0.537142857142857"</w:t>
+        <w:t xml:space="preserve">## [1] "Precision 0.801324503311258 Recall 0.695402298850575 F1 0.744615384615385 Accuracy 0.762857142857143"</w:t>
       </w:r>
     </w:p>
     <w:p>
@@ -4669,7 +4687,7 @@
               <a:graphicData uri="http://schemas.openxmlformats.org/drawingml/2006/picture">
                 <pic:pic>
                   <pic:nvPicPr>
-                    <pic:cNvPr descr="/home/lucas/heimdall/examples/2_online_prediction/doc/dfr_cusum_files/75330e5f4baaffceeded23955659823c2c644329.png" id="29" name="Picture"/>
+                    <pic:cNvPr descr="/home/lucas/heimdall/examples/2_online_prediction/doc/dfr_cusum_files/3b853fc0a17cf337f845ef69ff1196bacd705697.png" id="29" name="Picture"/>
                     <pic:cNvPicPr>
                       <a:picLocks noChangeArrowheads="1" noChangeAspect="1"/>
                     </pic:cNvPicPr>

</xml_diff>